<commit_message>
Refine capability statement for government procurement
</commit_message>
<xml_diff>
--- a/output/docx/lecrown-development-capability-statement.docx
+++ b/output/docx/lecrown-development-capability-statement.docx
@@ -98,9 +98,9 @@
                 <w:rFonts w:ascii="Arial" w:hAnsi="Arial"/>
                 <w:b w:val="0"/>
                 <w:color w:val="4F5D6B"/>
-                <w:sz w:val="14"/>
+                <w:sz w:val="15"/>
               </w:rPr>
-              <w:t>Benjamin LaGrone | Founder &amp; Principal Technology Consultant</w:t>
+              <w:t>Benjamin LaGrone | Principal Technology Consultant</w:t>
               <w:br/>
               <w:t>Houston, TX 77024 | (910) 236-9853</w:t>
               <w:br/>
@@ -156,7 +156,7 @@
     </w:tbl>
     <w:p>
       <w:r>
-        <w:t>LeCrown Development designs and delivers governed enterprise technology that moves complex initiatives from strategy to secure, measurable operation. Founder-led execution combines architecture, engineering and delivery leadership in one accountable team.</w:t>
+        <w:t>We help agencies and prime contractors protect sensitive data, reduce operating cost and replace manual work with secure, auditable software and AI-enabled workflows. Fortune 100 companies have entrusted our key personnel to deliver complex data and technology initiatives from requirements through turnkey operation.</w:t>
       </w:r>
     </w:p>
     <w:p>
@@ -164,7 +164,7 @@
         <w:ind w:left="173" w:hanging="144"/>
       </w:pPr>
       <w:r>
-        <w:t>• Enterprise data and AI platform architecture, governance, MLOps and knowledge systems</w:t>
+        <w:t>• Cybersecurity &amp; data protection — least-privilege access, identity controls, encryption, audit trails, secure cloud design and DevSecOps</w:t>
       </w:r>
     </w:p>
     <w:p>
@@ -172,7 +172,7 @@
         <w:ind w:left="173" w:hanging="144"/>
       </w:pPr>
       <w:r>
-        <w:t>• Cloud modernization, platform engineering, DevSecOps, infrastructure as code and FinOps</w:t>
+        <w:t>• IT modernization &amp; workflow automation — replace manual handoffs and disconnected tools with integrated, measurable software workflows</w:t>
       </w:r>
     </w:p>
     <w:p>
@@ -180,7 +180,7 @@
         <w:ind w:left="173" w:hanging="144"/>
       </w:pPr>
       <w:r>
-        <w:t>• Custom software, portals, APIs, workflow automation, systems integration and decision support</w:t>
+        <w:t>• AI &amp; data innovation — governed AI, reusable data platforms, MLOps, knowledge systems and human oversight for responsible decisions</w:t>
       </w:r>
     </w:p>
     <w:p>
@@ -188,7 +188,7 @@
         <w:ind w:left="173" w:hanging="144"/>
       </w:pPr>
       <w:r>
-        <w:t>• Technology strategy, solution architecture, program delivery and operating-model design</w:t>
+        <w:t>• Turnkey systems delivery — discovery, system design, engineering, integration, deployment, documentation and knowledge transfer</w:t>
       </w:r>
     </w:p>
     <w:tbl>
@@ -227,14 +227,13 @@
         <w:tblLook w:firstColumn="1" w:firstRow="1" w:lastColumn="0" w:lastRow="0" w:noHBand="0" w:noVBand="1" w:val="04A0"/>
       </w:tblPr>
       <w:tblGrid>
-        <w:gridCol w:w="3715"/>
-        <w:gridCol w:w="3715"/>
-        <w:gridCol w:w="3715"/>
+        <w:gridCol w:w="5573"/>
+        <w:gridCol w:w="5573"/>
       </w:tblGrid>
       <w:tr>
         <w:tc>
           <w:tcPr>
-            <w:tcW w:type="dxa" w:w="3715"/>
+            <w:tcW w:type="dxa" w:w="5573"/>
             <w:vAlign w:val="center"/>
           </w:tcPr>
           <w:p>
@@ -246,15 +245,15 @@
                 <w:color w:val="0F1726"/>
                 <w:sz w:val="14"/>
               </w:rPr>
-              <w:t>Sysco | Enterprise Data &amp; AI Platform Architecture (Key Personnel, 2024-present)</w:t>
+              <w:t>Sysco | Fortune 100 Food Distribution (Subcontractor through Revolution Technologies, 2024-present)</w:t>
               <w:br/>
-              <w:t>Designed governed cloud-platform patterns, self-service provisioning, identity and policy controls, reusable delivery capabilities and operating-model guidance for enterprise data and AI teams.</w:t>
+              <w:t>Entrusted with enterprise data and AI platform delivery in a high-volume operating environment. Designed secure self-service patterns, role-based access, policy controls and auditable workflows that help teams deliver faster without weakening protection of company data.</w:t>
             </w:r>
           </w:p>
         </w:tc>
         <w:tc>
           <w:tcPr>
-            <w:tcW w:type="dxa" w:w="3715"/>
+            <w:tcW w:type="dxa" w:w="5573"/>
             <w:vAlign w:val="center"/>
           </w:tcPr>
           <w:p>
@@ -266,29 +265,9 @@
                 <w:color w:val="0F1726"/>
                 <w:sz w:val="14"/>
               </w:rPr>
-              <w:t>LeCrown Development | Secure Digital Portals &amp; Automation (2025-present)</w:t>
+              <w:t>Energy &amp; Industrial (ExxonMobil, Shell, bp, SLB, McDermott and Oceaneering)</w:t>
               <w:br/>
-              <w:t>Architected and delivered client portals, authenticated document workflows, intake automation, service integrations and containerized cloud deployments from discovery through production.</w:t>
-            </w:r>
-          </w:p>
-        </w:tc>
-        <w:tc>
-          <w:tcPr>
-            <w:tcW w:type="dxa" w:w="3715"/>
-            <w:vAlign w:val="center"/>
-          </w:tcPr>
-          <w:p>
-            <w:r/>
-            <w:r>
-              <w:rPr>
-                <w:rFonts w:ascii="Arial" w:hAnsi="Arial"/>
-                <w:b w:val="0"/>
-                <w:color w:val="0F1726"/>
-                <w:sz w:val="14"/>
-              </w:rPr>
-              <w:t>Energy &amp; Industrial Enterprises | Cloud, Data &amp; Application Delivery (Key Personnel)</w:t>
-              <w:br/>
-              <w:t>Led solution architecture, software delivery, integration and modernization initiatives in asset-intensive, regulated operating environments with globally distributed stakeholders.</w:t>
+              <w:t>Served major corporations as a subcontractor through Cynet Systems, PTG, Accenture and Avanade. Simplified complex business and technical requirements, connected data and applications, and delivered cloud, software and automation improvements that reduced manual work, cost and operational risk.</w:t>
             </w:r>
           </w:p>
         </w:tc>
@@ -347,11 +326,13 @@
             <w:r>
               <w:rPr>
                 <w:rFonts w:ascii="Arial" w:hAnsi="Arial"/>
-                <w:b/>
+                <w:b w:val="0"/>
                 <w:color w:val="073C57"/>
-                <w:sz w:val="16"/>
+                <w:sz w:val="15"/>
               </w:rPr>
-              <w:t>50% cycle and cost reduction achieved through automated data-pipeline delivery.</w:t>
+              <w:t>SECURE BY DESIGN</w:t>
+              <w:br/>
+              <w:t>Cybersecurity is built into access, data handling, deployment and auditability—not added after delivery. This reduces exposure and makes systems easier to govern.</w:t>
             </w:r>
           </w:p>
         </w:tc>
@@ -366,11 +347,13 @@
             <w:r>
               <w:rPr>
                 <w:rFonts w:ascii="Arial" w:hAnsi="Arial"/>
-                <w:b/>
+                <w:b w:val="0"/>
                 <w:color w:val="073C57"/>
-                <w:sz w:val="16"/>
+                <w:sz w:val="15"/>
               </w:rPr>
-              <w:t>$20M+ in program value protected through architecture and quality governance.</w:t>
+              <w:t>CAPABILITY SEED METHOD</w:t>
+              <w:br/>
+              <w:t>Start with one high-value workflow, prove it securely, document the pattern and reuse it. Each engagement leaves a repeatable capability—not a one-off prototype.</w:t>
             </w:r>
           </w:p>
         </w:tc>
@@ -385,11 +368,13 @@
             <w:r>
               <w:rPr>
                 <w:rFonts w:ascii="Arial" w:hAnsi="Arial"/>
-                <w:b/>
+                <w:b w:val="0"/>
                 <w:color w:val="073C57"/>
-                <w:sz w:val="16"/>
+                <w:sz w:val="15"/>
               </w:rPr>
-              <w:t>30% delivery improvement achieved through Agile and DevOps transformation.</w:t>
+              <w:t>MEASURABLE EFFICIENCY</w:t>
+              <w:br/>
+              <w:t>Documented engagements achieved 50% cycle and cost reduction, 30% delivery improvement, 75% process-cost savings and protected $20M+ in program value.</w:t>
             </w:r>
           </w:p>
         </w:tc>
@@ -404,11 +389,13 @@
             <w:r>
               <w:rPr>
                 <w:rFonts w:ascii="Arial" w:hAnsi="Arial"/>
-                <w:b/>
+                <w:b w:val="0"/>
                 <w:color w:val="073C57"/>
-                <w:sz w:val="16"/>
+                <w:sz w:val="15"/>
               </w:rPr>
-              <w:t>75% cost savings achieved through targeted business-process automation.</w:t>
+              <w:t>COMPLEXITY MADE CLEAR</w:t>
+              <w:br/>
+              <w:t>Translate cyber, data, AI and policy requirements into plain-language decisions, working software, operator guidance and accountable handoff.</w:t>
             </w:r>
           </w:p>
         </w:tc>
@@ -647,6 +634,11 @@
     <w:p>
       <w:r>
         <w:t>Credentials: Azure Data Fundamentals • Azure Databricks Platform Architect • Scrum Master Certified • B.S., University of Houston</w:t>
+      </w:r>
+    </w:p>
+    <w:p>
+      <w:r>
+        <w:t>Book &amp; Publications: Author, HTML5 and CSS3 Responsive Web Design Cookbook (Packt) • Technical publications and OSDU contributions</w:t>
       </w:r>
     </w:p>
     <w:p>

</xml_diff>

<commit_message>
Strengthen capability statement sales message
</commit_message>
<xml_diff>
--- a/output/docx/lecrown-development-capability-statement.docx
+++ b/output/docx/lecrown-development-capability-statement.docx
@@ -156,7 +156,7 @@
     </w:tbl>
     <w:p>
       <w:r>
-        <w:t>We help agencies and prime contractors protect sensitive data, reduce operating cost and replace manual work with secure, auditable software and AI-enabled workflows. Fortune 100 companies have entrusted our key personnel to deliver complex data and technology initiatives from requirements through turnkey operation.</w:t>
+        <w:t>LeCrown turns complex government and enterprise requirements into secure, cost-saving systems that are ready to operate. Fortune 100 companies have entrusted our key personnel to protect sensitive data, streamline critical work and deliver technology from first requirement through production and handoff. Agencies and prime contractors gain one accountable partner that can simplify the problem, build the solution and leave behind a capability their teams can sustain.</w:t>
       </w:r>
     </w:p>
     <w:p>
@@ -164,7 +164,7 @@
         <w:ind w:left="173" w:hanging="144"/>
       </w:pPr>
       <w:r>
-        <w:t>• Cybersecurity &amp; data protection — least-privilege access, identity controls, encryption, audit trails, secure cloud design and DevSecOps</w:t>
+        <w:t>• Cybersecurity, Zero Trust &amp; Data Protection — secure identity and access, least privilege, encryption, audit trails, DevSecOps and risk controls that protect sensitive information</w:t>
       </w:r>
     </w:p>
     <w:p>
@@ -172,7 +172,7 @@
         <w:ind w:left="173" w:hanging="144"/>
       </w:pPr>
       <w:r>
-        <w:t>• IT modernization &amp; workflow automation — replace manual handoffs and disconnected tools with integrated, measurable software workflows</w:t>
+        <w:t>• IT Modernization, Integration &amp; Cost Reduction — automate manual work, connect legacy and cloud systems, eliminate redundant steps and measure operating savings</w:t>
       </w:r>
     </w:p>
     <w:p>
@@ -180,7 +180,7 @@
         <w:ind w:left="173" w:hanging="144"/>
       </w:pPr>
       <w:r>
-        <w:t>• AI &amp; data innovation — governed AI, reusable data platforms, MLOps, knowledge systems and human oversight for responsible decisions</w:t>
+        <w:t>• AI, Data Platforms &amp; Responsible Innovation — governed data foundations, MLOps, knowledge systems, lineage and human oversight that make AI useful, secure and accountable</w:t>
       </w:r>
     </w:p>
     <w:p>
@@ -188,7 +188,7 @@
         <w:ind w:left="173" w:hanging="144"/>
       </w:pPr>
       <w:r>
-        <w:t>• Turnkey systems delivery — discovery, system design, engineering, integration, deployment, documentation and knowledge transfer</w:t>
+        <w:t>• Turnkey Software &amp; Cloud Delivery — requirements, system and software design, custom applications, APIs, infrastructure as code, testing, deployment, training and knowledge transfer</w:t>
       </w:r>
     </w:p>
     <w:tbl>

</xml_diff>